<commit_message>
Create word table with combined df data
</commit_message>
<xml_diff>
--- a/data/output_files/250314_LION様_P36_Positive Habits創出への取組み-ja-en-D_merged.docx
+++ b/data/output_files/250314_LION様_P36_Positive Habits創出への取組み-ja-en-D_merged.docx
@@ -92,7 +92,7 @@
               <w:rPr>
                 <w:sz w:val="16"/>
               </w:rPr>
-              <w:t>1</w:t>
+              <w:t>SHIZNVRkbaS9wJZp_dc8:0</w:t>
             </w:r>
           </w:p>
         </w:tc>
@@ -149,7 +149,7 @@
               <w:rPr>
                 <w:sz w:val="16"/>
               </w:rPr>
-              <w:t>2</w:t>
+              <w:t>SHIZNVRkbaS9wJZp_dc8:1</w:t>
             </w:r>
           </w:p>
         </w:tc>
@@ -206,7 +206,7 @@
               <w:rPr>
                 <w:sz w:val="16"/>
               </w:rPr>
-              <w:t>3</w:t>
+              <w:t>SHIZNVRkbaS9wJZp_dc8:2</w:t>
             </w:r>
           </w:p>
         </w:tc>
@@ -263,7 +263,7 @@
               <w:rPr>
                 <w:sz w:val="16"/>
               </w:rPr>
-              <w:t>4</w:t>
+              <w:t>SHIZNVRkbaS9wJZp_dc8:3</w:t>
             </w:r>
           </w:p>
         </w:tc>
@@ -320,7 +320,7 @@
               <w:rPr>
                 <w:sz w:val="16"/>
               </w:rPr>
-              <w:t>5</w:t>
+              <w:t>SHIZNVRkbaS9wJZp_dc8:4</w:t>
             </w:r>
           </w:p>
         </w:tc>
@@ -377,7 +377,7 @@
               <w:rPr>
                 <w:sz w:val="16"/>
               </w:rPr>
-              <w:t>6</w:t>
+              <w:t>SHIZNVRkbaS9wJZp_dc8:5</w:t>
             </w:r>
           </w:p>
         </w:tc>
@@ -434,7 +434,7 @@
               <w:rPr>
                 <w:sz w:val="16"/>
               </w:rPr>
-              <w:t>7</w:t>
+              <w:t>SHIZNVRkbaS9wJZp_dc8:6</w:t>
             </w:r>
           </w:p>
         </w:tc>
@@ -491,7 +491,7 @@
               <w:rPr>
                 <w:sz w:val="16"/>
               </w:rPr>
-              <w:t>8</w:t>
+              <w:t>SHIZNVRkbaS9wJZp_dc8:7</w:t>
             </w:r>
           </w:p>
         </w:tc>
@@ -548,7 +548,7 @@
               <w:rPr>
                 <w:sz w:val="16"/>
               </w:rPr>
-              <w:t>9</w:t>
+              <w:t>SHIZNVRkbaS9wJZp_dc8:8</w:t>
             </w:r>
           </w:p>
         </w:tc>
@@ -605,7 +605,7 @@
               <w:rPr>
                 <w:sz w:val="16"/>
               </w:rPr>
-              <w:t>10</w:t>
+              <w:t>SHIZNVRkbaS9wJZp_dc8:9:0</w:t>
             </w:r>
           </w:p>
         </w:tc>
@@ -662,7 +662,7 @@
               <w:rPr>
                 <w:sz w:val="16"/>
               </w:rPr>
-              <w:t>11</w:t>
+              <w:t>SHIZNVRkbaS9wJZp_dc8:9:1</w:t>
             </w:r>
           </w:p>
         </w:tc>
@@ -719,7 +719,7 @@
               <w:rPr>
                 <w:sz w:val="16"/>
               </w:rPr>
-              <w:t>12</w:t>
+              <w:t>SHIZNVRkbaS9wJZp_dc8:10:0</w:t>
             </w:r>
           </w:p>
         </w:tc>
@@ -776,7 +776,7 @@
               <w:rPr>
                 <w:sz w:val="16"/>
               </w:rPr>
-              <w:t>13</w:t>
+              <w:t>SHIZNVRkbaS9wJZp_dc8:10:1</w:t>
             </w:r>
           </w:p>
         </w:tc>
@@ -833,7 +833,7 @@
               <w:rPr>
                 <w:sz w:val="16"/>
               </w:rPr>
-              <w:t>14</w:t>
+              <w:t>SHIZNVRkbaS9wJZp_dc8:11</w:t>
             </w:r>
           </w:p>
         </w:tc>
@@ -890,7 +890,7 @@
               <w:rPr>
                 <w:sz w:val="16"/>
               </w:rPr>
-              <w:t>15</w:t>
+              <w:t>SHIZNVRkbaS9wJZp_dc8:12</w:t>
             </w:r>
           </w:p>
         </w:tc>
@@ -948,7 +948,7 @@
               <w:rPr>
                 <w:sz w:val="16"/>
               </w:rPr>
-              <w:t>16</w:t>
+              <w:t>SHIZNVRkbaS9wJZp_dc8:13</w:t>
             </w:r>
           </w:p>
         </w:tc>
@@ -1009,7 +1009,7 @@
               <w:rPr>
                 <w:sz w:val="16"/>
               </w:rPr>
-              <w:t>17</w:t>
+              <w:t>SHIZNVRkbaS9wJZp_dc8:14</w:t>
             </w:r>
           </w:p>
         </w:tc>
@@ -1069,7 +1069,7 @@
               <w:rPr>
                 <w:sz w:val="16"/>
               </w:rPr>
-              <w:t>18</w:t>
+              <w:t>SHIZNVRkbaS9wJZp_dc8:15</w:t>
             </w:r>
           </w:p>
         </w:tc>
@@ -1126,7 +1126,7 @@
               <w:rPr>
                 <w:sz w:val="16"/>
               </w:rPr>
-              <w:t>19</w:t>
+              <w:t>SHIZNVRkbaS9wJZp_dc8:16</w:t>
             </w:r>
           </w:p>
         </w:tc>
@@ -1183,7 +1183,7 @@
               <w:rPr>
                 <w:sz w:val="16"/>
               </w:rPr>
-              <w:t>20</w:t>
+              <w:t>SHIZNVRkbaS9wJZp_dc8:17</w:t>
             </w:r>
           </w:p>
         </w:tc>
@@ -1240,7 +1240,7 @@
               <w:rPr>
                 <w:sz w:val="16"/>
               </w:rPr>
-              <w:t>21</w:t>
+              <w:t>SHIZNVRkbaS9wJZp_dc8:18</w:t>
             </w:r>
           </w:p>
         </w:tc>
@@ -1297,7 +1297,7 @@
               <w:rPr>
                 <w:sz w:val="16"/>
               </w:rPr>
-              <w:t>22</w:t>
+              <w:t>SHIZNVRkbaS9wJZp_dc8:19</w:t>
             </w:r>
           </w:p>
         </w:tc>
@@ -1354,7 +1354,7 @@
               <w:rPr>
                 <w:sz w:val="16"/>
               </w:rPr>
-              <w:t>23</w:t>
+              <w:t>SHIZNVRkbaS9wJZp_dc8:20</w:t>
             </w:r>
           </w:p>
         </w:tc>
@@ -1411,7 +1411,7 @@
               <w:rPr>
                 <w:sz w:val="16"/>
               </w:rPr>
-              <w:t>24</w:t>
+              <w:t>SHIZNVRkbaS9wJZp_dc8:21</w:t>
             </w:r>
           </w:p>
         </w:tc>
@@ -1468,7 +1468,7 @@
               <w:rPr>
                 <w:sz w:val="16"/>
               </w:rPr>
-              <w:t>25</w:t>
+              <w:t>SHIZNVRkbaS9wJZp_dc8:22</w:t>
             </w:r>
           </w:p>
         </w:tc>
@@ -1525,7 +1525,7 @@
               <w:rPr>
                 <w:sz w:val="16"/>
               </w:rPr>
-              <w:t>26</w:t>
+              <w:t>SHIZNVRkbaS9wJZp_dc8:23</w:t>
             </w:r>
           </w:p>
         </w:tc>
@@ -1582,7 +1582,7 @@
               <w:rPr>
                 <w:sz w:val="16"/>
               </w:rPr>
-              <w:t>27</w:t>
+              <w:t>SHIZNVRkbaS9wJZp_dc8:24</w:t>
             </w:r>
           </w:p>
         </w:tc>
@@ -1649,7 +1649,7 @@
               <w:rPr>
                 <w:sz w:val="16"/>
               </w:rPr>
-              <w:t>28</w:t>
+              <w:t>SHIZNVRkbaS9wJZp_dc8:25</w:t>
             </w:r>
           </w:p>
         </w:tc>
@@ -1728,7 +1728,7 @@
               <w:rPr>
                 <w:sz w:val="16"/>
               </w:rPr>
-              <w:t>29</w:t>
+              <w:t>SHIZNVRkbaS9wJZp_dc8:26</w:t>
             </w:r>
           </w:p>
         </w:tc>
@@ -1785,7 +1785,7 @@
               <w:rPr>
                 <w:sz w:val="16"/>
               </w:rPr>
-              <w:t>30</w:t>
+              <w:t>SHIZNVRkbaS9wJZp_dc8:27:0</w:t>
             </w:r>
           </w:p>
         </w:tc>
@@ -1850,7 +1850,7 @@
               <w:rPr>
                 <w:sz w:val="16"/>
               </w:rPr>
-              <w:t>31</w:t>
+              <w:t>SHIZNVRkbaS9wJZp_dc8:29</w:t>
             </w:r>
           </w:p>
         </w:tc>
@@ -1907,7 +1907,7 @@
               <w:rPr>
                 <w:sz w:val="16"/>
               </w:rPr>
-              <w:t>32</w:t>
+              <w:t>SHIZNVRkbaS9wJZp_dc8:30</w:t>
             </w:r>
           </w:p>
         </w:tc>
@@ -1964,7 +1964,7 @@
               <w:rPr>
                 <w:sz w:val="16"/>
               </w:rPr>
-              <w:t>33</w:t>
+              <w:t>SHIZNVRkbaS9wJZp_dc8:31</w:t>
             </w:r>
           </w:p>
         </w:tc>
@@ -2021,7 +2021,7 @@
               <w:rPr>
                 <w:sz w:val="16"/>
               </w:rPr>
-              <w:t>34</w:t>
+              <w:t>SHIZNVRkbaS9wJZp_dc8:32:0</w:t>
             </w:r>
           </w:p>
         </w:tc>
@@ -2092,7 +2092,7 @@
               <w:rPr>
                 <w:sz w:val="16"/>
               </w:rPr>
-              <w:t>35</w:t>
+              <w:t>SHIZNVRkbaS9wJZp_dc8:34</w:t>
             </w:r>
           </w:p>
         </w:tc>
@@ -2149,7 +2149,7 @@
               <w:rPr>
                 <w:sz w:val="16"/>
               </w:rPr>
-              <w:t>36</w:t>
+              <w:t>SHIZNVRkbaS9wJZp_dc8:35</w:t>
             </w:r>
           </w:p>
         </w:tc>
@@ -2213,7 +2213,7 @@
               <w:rPr>
                 <w:sz w:val="16"/>
               </w:rPr>
-              <w:t>37</w:t>
+              <w:t>SHIZNVRkbaS9wJZp_dc8:36</w:t>
             </w:r>
           </w:p>
         </w:tc>
@@ -2267,118 +2267,6 @@
               <w:br/>
               <w:t>ゲラでは文末の「の改良」はありません。ご確認、ご対応をお願いいたします。</w:t>
             </w:r>
-          </w:p>
-        </w:tc>
-      </w:tr>
-      <w:tr>
-        <w:tc>
-          <w:tcPr>
-            <w:tcW w:type="dxa" w:w="510"/>
-          </w:tcPr>
-          <w:p>
-            <w:pPr>
-              <w:spacing w:line="276" w:lineRule="auto"/>
-            </w:pPr>
-            <w:r>
-              <w:rPr>
-                <w:sz w:val="16"/>
-              </w:rPr>
-              <w:t>11</w:t>
-            </w:r>
-          </w:p>
-        </w:tc>
-        <w:tc>
-          <w:tcPr>
-            <w:tcW w:type="dxa" w:w="4592"/>
-          </w:tcPr>
-          <w:p>
-            <w:pPr>
-              <w:spacing w:line="276" w:lineRule="auto"/>
-            </w:pPr>
-            <w:r>
-              <w:rPr>
-                <w:lang w:val="ja-JP"/>
-              </w:rPr>
-              <w:t xml:space="preserve"> (気が進まない習慣)</w:t>
-            </w:r>
-          </w:p>
-        </w:tc>
-        <w:tc>
-          <w:tcPr>
-            <w:tcW w:type="dxa" w:w="6350"/>
-          </w:tcPr>
-          <w:p>
-            <w:pPr>
-              <w:spacing w:line="276" w:lineRule="auto"/>
-            </w:pPr>
-            <w:r/>
-          </w:p>
-        </w:tc>
-        <w:tc>
-          <w:tcPr>
-            <w:tcW w:type="dxa" w:w="1134"/>
-          </w:tcPr>
-          <w:p>
-            <w:pPr>
-              <w:spacing w:line="276" w:lineRule="auto"/>
-            </w:pPr>
-            <w:r/>
-          </w:p>
-        </w:tc>
-      </w:tr>
-      <w:tr>
-        <w:tc>
-          <w:tcPr>
-            <w:tcW w:type="dxa" w:w="510"/>
-          </w:tcPr>
-          <w:p>
-            <w:pPr>
-              <w:spacing w:line="276" w:lineRule="auto"/>
-            </w:pPr>
-            <w:r>
-              <w:rPr>
-                <w:sz w:val="16"/>
-              </w:rPr>
-              <w:t>13</w:t>
-            </w:r>
-          </w:p>
-        </w:tc>
-        <w:tc>
-          <w:tcPr>
-            <w:tcW w:type="dxa" w:w="4592"/>
-          </w:tcPr>
-          <w:p>
-            <w:pPr>
-              <w:spacing w:line="276" w:lineRule="auto"/>
-            </w:pPr>
-            <w:r>
-              <w:rPr>
-                <w:lang w:val="ja-JP"/>
-              </w:rPr>
-              <w:t xml:space="preserve"> (より良い習慣)</w:t>
-            </w:r>
-          </w:p>
-        </w:tc>
-        <w:tc>
-          <w:tcPr>
-            <w:tcW w:type="dxa" w:w="6350"/>
-          </w:tcPr>
-          <w:p>
-            <w:pPr>
-              <w:spacing w:line="276" w:lineRule="auto"/>
-            </w:pPr>
-            <w:r/>
-          </w:p>
-        </w:tc>
-        <w:tc>
-          <w:tcPr>
-            <w:tcW w:type="dxa" w:w="1134"/>
-          </w:tcPr>
-          <w:p>
-            <w:pPr>
-              <w:spacing w:line="276" w:lineRule="auto"/>
-            </w:pPr>
-            <w:r/>
           </w:p>
         </w:tc>
       </w:tr>

</xml_diff>

<commit_message>
Renumber new P column
</commit_message>
<xml_diff>
--- a/data/output_files/250314_LION様_P36_Positive Habits創出への取組み-ja-en-D_merged.docx
+++ b/data/output_files/250314_LION様_P36_Positive Habits創出への取組み-ja-en-D_merged.docx
@@ -92,7 +92,7 @@
               <w:rPr>
                 <w:sz w:val="16"/>
               </w:rPr>
-              <w:t>SHIZNVRkbaS9wJZp_dc8:0</w:t>
+              <w:t>1</w:t>
             </w:r>
           </w:p>
         </w:tc>
@@ -149,7 +149,7 @@
               <w:rPr>
                 <w:sz w:val="16"/>
               </w:rPr>
-              <w:t>SHIZNVRkbaS9wJZp_dc8:1</w:t>
+              <w:t>2</w:t>
             </w:r>
           </w:p>
         </w:tc>
@@ -206,7 +206,7 @@
               <w:rPr>
                 <w:sz w:val="16"/>
               </w:rPr>
-              <w:t>SHIZNVRkbaS9wJZp_dc8:2</w:t>
+              <w:t>3</w:t>
             </w:r>
           </w:p>
         </w:tc>
@@ -263,7 +263,7 @@
               <w:rPr>
                 <w:sz w:val="16"/>
               </w:rPr>
-              <w:t>SHIZNVRkbaS9wJZp_dc8:3</w:t>
+              <w:t>4</w:t>
             </w:r>
           </w:p>
         </w:tc>
@@ -320,7 +320,7 @@
               <w:rPr>
                 <w:sz w:val="16"/>
               </w:rPr>
-              <w:t>SHIZNVRkbaS9wJZp_dc8:4</w:t>
+              <w:t>5</w:t>
             </w:r>
           </w:p>
         </w:tc>
@@ -377,7 +377,7 @@
               <w:rPr>
                 <w:sz w:val="16"/>
               </w:rPr>
-              <w:t>SHIZNVRkbaS9wJZp_dc8:5</w:t>
+              <w:t>6</w:t>
             </w:r>
           </w:p>
         </w:tc>
@@ -434,7 +434,7 @@
               <w:rPr>
                 <w:sz w:val="16"/>
               </w:rPr>
-              <w:t>SHIZNVRkbaS9wJZp_dc8:6</w:t>
+              <w:t>7</w:t>
             </w:r>
           </w:p>
         </w:tc>
@@ -491,7 +491,7 @@
               <w:rPr>
                 <w:sz w:val="16"/>
               </w:rPr>
-              <w:t>SHIZNVRkbaS9wJZp_dc8:7</w:t>
+              <w:t>8</w:t>
             </w:r>
           </w:p>
         </w:tc>
@@ -548,7 +548,7 @@
               <w:rPr>
                 <w:sz w:val="16"/>
               </w:rPr>
-              <w:t>SHIZNVRkbaS9wJZp_dc8:8</w:t>
+              <w:t>9</w:t>
             </w:r>
           </w:p>
         </w:tc>
@@ -605,7 +605,7 @@
               <w:rPr>
                 <w:sz w:val="16"/>
               </w:rPr>
-              <w:t>SHIZNVRkbaS9wJZp_dc8:9:0</w:t>
+              <w:t>10</w:t>
             </w:r>
           </w:p>
         </w:tc>
@@ -662,7 +662,7 @@
               <w:rPr>
                 <w:sz w:val="16"/>
               </w:rPr>
-              <w:t>SHIZNVRkbaS9wJZp_dc8:9:1</w:t>
+              <w:t>11</w:t>
             </w:r>
           </w:p>
         </w:tc>
@@ -719,7 +719,7 @@
               <w:rPr>
                 <w:sz w:val="16"/>
               </w:rPr>
-              <w:t>SHIZNVRkbaS9wJZp_dc8:10:0</w:t>
+              <w:t>12</w:t>
             </w:r>
           </w:p>
         </w:tc>
@@ -776,7 +776,7 @@
               <w:rPr>
                 <w:sz w:val="16"/>
               </w:rPr>
-              <w:t>SHIZNVRkbaS9wJZp_dc8:10:1</w:t>
+              <w:t>13</w:t>
             </w:r>
           </w:p>
         </w:tc>
@@ -833,7 +833,7 @@
               <w:rPr>
                 <w:sz w:val="16"/>
               </w:rPr>
-              <w:t>SHIZNVRkbaS9wJZp_dc8:11</w:t>
+              <w:t>14</w:t>
             </w:r>
           </w:p>
         </w:tc>
@@ -890,7 +890,7 @@
               <w:rPr>
                 <w:sz w:val="16"/>
               </w:rPr>
-              <w:t>SHIZNVRkbaS9wJZp_dc8:12</w:t>
+              <w:t>15</w:t>
             </w:r>
           </w:p>
         </w:tc>
@@ -948,7 +948,7 @@
               <w:rPr>
                 <w:sz w:val="16"/>
               </w:rPr>
-              <w:t>SHIZNVRkbaS9wJZp_dc8:13</w:t>
+              <w:t>16</w:t>
             </w:r>
           </w:p>
         </w:tc>
@@ -1009,7 +1009,7 @@
               <w:rPr>
                 <w:sz w:val="16"/>
               </w:rPr>
-              <w:t>SHIZNVRkbaS9wJZp_dc8:14</w:t>
+              <w:t>17</w:t>
             </w:r>
           </w:p>
         </w:tc>
@@ -1069,7 +1069,7 @@
               <w:rPr>
                 <w:sz w:val="16"/>
               </w:rPr>
-              <w:t>SHIZNVRkbaS9wJZp_dc8:15</w:t>
+              <w:t>18</w:t>
             </w:r>
           </w:p>
         </w:tc>
@@ -1126,7 +1126,7 @@
               <w:rPr>
                 <w:sz w:val="16"/>
               </w:rPr>
-              <w:t>SHIZNVRkbaS9wJZp_dc8:16</w:t>
+              <w:t>19</w:t>
             </w:r>
           </w:p>
         </w:tc>
@@ -1183,7 +1183,7 @@
               <w:rPr>
                 <w:sz w:val="16"/>
               </w:rPr>
-              <w:t>SHIZNVRkbaS9wJZp_dc8:17</w:t>
+              <w:t>20</w:t>
             </w:r>
           </w:p>
         </w:tc>
@@ -1240,7 +1240,7 @@
               <w:rPr>
                 <w:sz w:val="16"/>
               </w:rPr>
-              <w:t>SHIZNVRkbaS9wJZp_dc8:18</w:t>
+              <w:t>21</w:t>
             </w:r>
           </w:p>
         </w:tc>
@@ -1297,7 +1297,7 @@
               <w:rPr>
                 <w:sz w:val="16"/>
               </w:rPr>
-              <w:t>SHIZNVRkbaS9wJZp_dc8:19</w:t>
+              <w:t>22</w:t>
             </w:r>
           </w:p>
         </w:tc>
@@ -1354,7 +1354,7 @@
               <w:rPr>
                 <w:sz w:val="16"/>
               </w:rPr>
-              <w:t>SHIZNVRkbaS9wJZp_dc8:20</w:t>
+              <w:t>23</w:t>
             </w:r>
           </w:p>
         </w:tc>
@@ -1411,7 +1411,7 @@
               <w:rPr>
                 <w:sz w:val="16"/>
               </w:rPr>
-              <w:t>SHIZNVRkbaS9wJZp_dc8:21</w:t>
+              <w:t>24</w:t>
             </w:r>
           </w:p>
         </w:tc>
@@ -1468,7 +1468,7 @@
               <w:rPr>
                 <w:sz w:val="16"/>
               </w:rPr>
-              <w:t>SHIZNVRkbaS9wJZp_dc8:22</w:t>
+              <w:t>25</w:t>
             </w:r>
           </w:p>
         </w:tc>
@@ -1525,7 +1525,7 @@
               <w:rPr>
                 <w:sz w:val="16"/>
               </w:rPr>
-              <w:t>SHIZNVRkbaS9wJZp_dc8:23</w:t>
+              <w:t>26</w:t>
             </w:r>
           </w:p>
         </w:tc>
@@ -1582,7 +1582,7 @@
               <w:rPr>
                 <w:sz w:val="16"/>
               </w:rPr>
-              <w:t>SHIZNVRkbaS9wJZp_dc8:24</w:t>
+              <w:t>27</w:t>
             </w:r>
           </w:p>
         </w:tc>
@@ -1649,7 +1649,7 @@
               <w:rPr>
                 <w:sz w:val="16"/>
               </w:rPr>
-              <w:t>SHIZNVRkbaS9wJZp_dc8:25</w:t>
+              <w:t>28</w:t>
             </w:r>
           </w:p>
         </w:tc>
@@ -1728,7 +1728,7 @@
               <w:rPr>
                 <w:sz w:val="16"/>
               </w:rPr>
-              <w:t>SHIZNVRkbaS9wJZp_dc8:26</w:t>
+              <w:t>29</w:t>
             </w:r>
           </w:p>
         </w:tc>
@@ -1785,7 +1785,7 @@
               <w:rPr>
                 <w:sz w:val="16"/>
               </w:rPr>
-              <w:t>SHIZNVRkbaS9wJZp_dc8:27:0</w:t>
+              <w:t>30</w:t>
             </w:r>
           </w:p>
         </w:tc>
@@ -1850,7 +1850,7 @@
               <w:rPr>
                 <w:sz w:val="16"/>
               </w:rPr>
-              <w:t>SHIZNVRkbaS9wJZp_dc8:29</w:t>
+              <w:t>31</w:t>
             </w:r>
           </w:p>
         </w:tc>
@@ -1907,7 +1907,7 @@
               <w:rPr>
                 <w:sz w:val="16"/>
               </w:rPr>
-              <w:t>SHIZNVRkbaS9wJZp_dc8:30</w:t>
+              <w:t>32</w:t>
             </w:r>
           </w:p>
         </w:tc>
@@ -1964,7 +1964,7 @@
               <w:rPr>
                 <w:sz w:val="16"/>
               </w:rPr>
-              <w:t>SHIZNVRkbaS9wJZp_dc8:31</w:t>
+              <w:t>33</w:t>
             </w:r>
           </w:p>
         </w:tc>
@@ -2021,7 +2021,7 @@
               <w:rPr>
                 <w:sz w:val="16"/>
               </w:rPr>
-              <w:t>SHIZNVRkbaS9wJZp_dc8:32:0</w:t>
+              <w:t>34</w:t>
             </w:r>
           </w:p>
         </w:tc>
@@ -2092,7 +2092,7 @@
               <w:rPr>
                 <w:sz w:val="16"/>
               </w:rPr>
-              <w:t>SHIZNVRkbaS9wJZp_dc8:34</w:t>
+              <w:t>35</w:t>
             </w:r>
           </w:p>
         </w:tc>
@@ -2149,7 +2149,7 @@
               <w:rPr>
                 <w:sz w:val="16"/>
               </w:rPr>
-              <w:t>SHIZNVRkbaS9wJZp_dc8:35</w:t>
+              <w:t>36</w:t>
             </w:r>
           </w:p>
         </w:tc>
@@ -2213,7 +2213,7 @@
               <w:rPr>
                 <w:sz w:val="16"/>
               </w:rPr>
-              <w:t>SHIZNVRkbaS9wJZp_dc8:36</w:t>
+              <w:t>37</w:t>
             </w:r>
           </w:p>
         </w:tc>

</xml_diff>

<commit_message>
REMOVE UNNECESSARY FILES AND UPDATE CONFIG SETTINGS
Deleted unused scripts and CSV files from the data archive.
Updated the configuration settings to modify row width in the
CSV output.
</commit_message>
<xml_diff>
--- a/data/output_files/250314_LION様_P36_Positive Habits創出への取組み-ja-en-D_merged.docx
+++ b/data/output_files/250314_LION様_P36_Positive Habits創出への取組み-ja-en-D_merged.docx
@@ -66,7 +66,7 @@
         </w:tc>
         <w:tc>
           <w:tcPr>
-            <w:tcW w:type="dxa" w:w="1134"/>
+            <w:tcW w:type="dxa" w:w="1191"/>
             <w:shd w:fill="95B3D7"/>
           </w:tcPr>
           <w:p>
@@ -126,7 +126,7 @@
         </w:tc>
         <w:tc>
           <w:tcPr>
-            <w:tcW w:type="dxa" w:w="1134"/>
+            <w:tcW w:type="dxa" w:w="1191"/>
           </w:tcPr>
           <w:p>
             <w:pPr>
@@ -183,7 +183,7 @@
         </w:tc>
         <w:tc>
           <w:tcPr>
-            <w:tcW w:type="dxa" w:w="1134"/>
+            <w:tcW w:type="dxa" w:w="1191"/>
           </w:tcPr>
           <w:p>
             <w:pPr>
@@ -240,7 +240,7 @@
         </w:tc>
         <w:tc>
           <w:tcPr>
-            <w:tcW w:type="dxa" w:w="1134"/>
+            <w:tcW w:type="dxa" w:w="1191"/>
           </w:tcPr>
           <w:p>
             <w:pPr>
@@ -297,7 +297,7 @@
         </w:tc>
         <w:tc>
           <w:tcPr>
-            <w:tcW w:type="dxa" w:w="1134"/>
+            <w:tcW w:type="dxa" w:w="1191"/>
           </w:tcPr>
           <w:p>
             <w:pPr>
@@ -354,7 +354,7 @@
         </w:tc>
         <w:tc>
           <w:tcPr>
-            <w:tcW w:type="dxa" w:w="1134"/>
+            <w:tcW w:type="dxa" w:w="1191"/>
           </w:tcPr>
           <w:p>
             <w:pPr>
@@ -411,7 +411,7 @@
         </w:tc>
         <w:tc>
           <w:tcPr>
-            <w:tcW w:type="dxa" w:w="1134"/>
+            <w:tcW w:type="dxa" w:w="1191"/>
           </w:tcPr>
           <w:p>
             <w:pPr>
@@ -468,7 +468,7 @@
         </w:tc>
         <w:tc>
           <w:tcPr>
-            <w:tcW w:type="dxa" w:w="1134"/>
+            <w:tcW w:type="dxa" w:w="1191"/>
           </w:tcPr>
           <w:p>
             <w:pPr>
@@ -525,7 +525,7 @@
         </w:tc>
         <w:tc>
           <w:tcPr>
-            <w:tcW w:type="dxa" w:w="1134"/>
+            <w:tcW w:type="dxa" w:w="1191"/>
           </w:tcPr>
           <w:p>
             <w:pPr>
@@ -582,7 +582,7 @@
         </w:tc>
         <w:tc>
           <w:tcPr>
-            <w:tcW w:type="dxa" w:w="1134"/>
+            <w:tcW w:type="dxa" w:w="1191"/>
           </w:tcPr>
           <w:p>
             <w:pPr>
@@ -639,7 +639,7 @@
         </w:tc>
         <w:tc>
           <w:tcPr>
-            <w:tcW w:type="dxa" w:w="1134"/>
+            <w:tcW w:type="dxa" w:w="1191"/>
           </w:tcPr>
           <w:p>
             <w:pPr>
@@ -696,7 +696,7 @@
         </w:tc>
         <w:tc>
           <w:tcPr>
-            <w:tcW w:type="dxa" w:w="1134"/>
+            <w:tcW w:type="dxa" w:w="1191"/>
           </w:tcPr>
           <w:p>
             <w:pPr>
@@ -753,7 +753,7 @@
         </w:tc>
         <w:tc>
           <w:tcPr>
-            <w:tcW w:type="dxa" w:w="1134"/>
+            <w:tcW w:type="dxa" w:w="1191"/>
           </w:tcPr>
           <w:p>
             <w:pPr>
@@ -810,7 +810,7 @@
         </w:tc>
         <w:tc>
           <w:tcPr>
-            <w:tcW w:type="dxa" w:w="1134"/>
+            <w:tcW w:type="dxa" w:w="1191"/>
           </w:tcPr>
           <w:p>
             <w:pPr>
@@ -867,7 +867,7 @@
         </w:tc>
         <w:tc>
           <w:tcPr>
-            <w:tcW w:type="dxa" w:w="1134"/>
+            <w:tcW w:type="dxa" w:w="1191"/>
           </w:tcPr>
           <w:p>
             <w:pPr>
@@ -924,7 +924,7 @@
         </w:tc>
         <w:tc>
           <w:tcPr>
-            <w:tcW w:type="dxa" w:w="1134"/>
+            <w:tcW w:type="dxa" w:w="1191"/>
           </w:tcPr>
           <w:p>
             <w:pPr>
@@ -984,7 +984,7 @@
         </w:tc>
         <w:tc>
           <w:tcPr>
-            <w:tcW w:type="dxa" w:w="1134"/>
+            <w:tcW w:type="dxa" w:w="1191"/>
             <w:shd w:fill="D9D9D9"/>
           </w:tcPr>
           <w:p>
@@ -1045,7 +1045,7 @@
         </w:tc>
         <w:tc>
           <w:tcPr>
-            <w:tcW w:type="dxa" w:w="1134"/>
+            <w:tcW w:type="dxa" w:w="1191"/>
             <w:shd w:fill="D9D9D9"/>
           </w:tcPr>
           <w:p>
@@ -1103,7 +1103,7 @@
         </w:tc>
         <w:tc>
           <w:tcPr>
-            <w:tcW w:type="dxa" w:w="1134"/>
+            <w:tcW w:type="dxa" w:w="1191"/>
           </w:tcPr>
           <w:p>
             <w:pPr>
@@ -1160,7 +1160,7 @@
         </w:tc>
         <w:tc>
           <w:tcPr>
-            <w:tcW w:type="dxa" w:w="1134"/>
+            <w:tcW w:type="dxa" w:w="1191"/>
           </w:tcPr>
           <w:p>
             <w:pPr>
@@ -1217,7 +1217,7 @@
         </w:tc>
         <w:tc>
           <w:tcPr>
-            <w:tcW w:type="dxa" w:w="1134"/>
+            <w:tcW w:type="dxa" w:w="1191"/>
           </w:tcPr>
           <w:p>
             <w:pPr>
@@ -1274,7 +1274,7 @@
         </w:tc>
         <w:tc>
           <w:tcPr>
-            <w:tcW w:type="dxa" w:w="1134"/>
+            <w:tcW w:type="dxa" w:w="1191"/>
           </w:tcPr>
           <w:p>
             <w:pPr>
@@ -1331,7 +1331,7 @@
         </w:tc>
         <w:tc>
           <w:tcPr>
-            <w:tcW w:type="dxa" w:w="1134"/>
+            <w:tcW w:type="dxa" w:w="1191"/>
           </w:tcPr>
           <w:p>
             <w:pPr>
@@ -1388,7 +1388,7 @@
         </w:tc>
         <w:tc>
           <w:tcPr>
-            <w:tcW w:type="dxa" w:w="1134"/>
+            <w:tcW w:type="dxa" w:w="1191"/>
           </w:tcPr>
           <w:p>
             <w:pPr>
@@ -1445,7 +1445,7 @@
         </w:tc>
         <w:tc>
           <w:tcPr>
-            <w:tcW w:type="dxa" w:w="1134"/>
+            <w:tcW w:type="dxa" w:w="1191"/>
           </w:tcPr>
           <w:p>
             <w:pPr>
@@ -1502,7 +1502,7 @@
         </w:tc>
         <w:tc>
           <w:tcPr>
-            <w:tcW w:type="dxa" w:w="1134"/>
+            <w:tcW w:type="dxa" w:w="1191"/>
           </w:tcPr>
           <w:p>
             <w:pPr>
@@ -1559,7 +1559,7 @@
         </w:tc>
         <w:tc>
           <w:tcPr>
-            <w:tcW w:type="dxa" w:w="1134"/>
+            <w:tcW w:type="dxa" w:w="1191"/>
           </w:tcPr>
           <w:p>
             <w:pPr>
@@ -1616,7 +1616,7 @@
         </w:tc>
         <w:tc>
           <w:tcPr>
-            <w:tcW w:type="dxa" w:w="1134"/>
+            <w:tcW w:type="dxa" w:w="1191"/>
           </w:tcPr>
           <w:p>
             <w:pPr>
@@ -1683,7 +1683,7 @@
         </w:tc>
         <w:tc>
           <w:tcPr>
-            <w:tcW w:type="dxa" w:w="1134"/>
+            <w:tcW w:type="dxa" w:w="1191"/>
           </w:tcPr>
           <w:p>
             <w:pPr>
@@ -1762,7 +1762,7 @@
         </w:tc>
         <w:tc>
           <w:tcPr>
-            <w:tcW w:type="dxa" w:w="1134"/>
+            <w:tcW w:type="dxa" w:w="1191"/>
           </w:tcPr>
           <w:p>
             <w:pPr>
@@ -1827,7 +1827,7 @@
         </w:tc>
         <w:tc>
           <w:tcPr>
-            <w:tcW w:type="dxa" w:w="1134"/>
+            <w:tcW w:type="dxa" w:w="1191"/>
           </w:tcPr>
           <w:p>
             <w:pPr>
@@ -1884,7 +1884,7 @@
         </w:tc>
         <w:tc>
           <w:tcPr>
-            <w:tcW w:type="dxa" w:w="1134"/>
+            <w:tcW w:type="dxa" w:w="1191"/>
           </w:tcPr>
           <w:p>
             <w:pPr>
@@ -1941,7 +1941,7 @@
         </w:tc>
         <w:tc>
           <w:tcPr>
-            <w:tcW w:type="dxa" w:w="1134"/>
+            <w:tcW w:type="dxa" w:w="1191"/>
           </w:tcPr>
           <w:p>
             <w:pPr>
@@ -1998,7 +1998,7 @@
         </w:tc>
         <w:tc>
           <w:tcPr>
-            <w:tcW w:type="dxa" w:w="1134"/>
+            <w:tcW w:type="dxa" w:w="1191"/>
           </w:tcPr>
           <w:p>
             <w:pPr>
@@ -2063,7 +2063,7 @@
         </w:tc>
         <w:tc>
           <w:tcPr>
-            <w:tcW w:type="dxa" w:w="1134"/>
+            <w:tcW w:type="dxa" w:w="1191"/>
           </w:tcPr>
           <w:p>
             <w:pPr>
@@ -2126,7 +2126,7 @@
         </w:tc>
         <w:tc>
           <w:tcPr>
-            <w:tcW w:type="dxa" w:w="1134"/>
+            <w:tcW w:type="dxa" w:w="1191"/>
           </w:tcPr>
           <w:p>
             <w:pPr>
@@ -2183,7 +2183,7 @@
         </w:tc>
         <w:tc>
           <w:tcPr>
-            <w:tcW w:type="dxa" w:w="1134"/>
+            <w:tcW w:type="dxa" w:w="1191"/>
           </w:tcPr>
           <w:p>
             <w:pPr>
@@ -2247,7 +2247,7 @@
         </w:tc>
         <w:tc>
           <w:tcPr>
-            <w:tcW w:type="dxa" w:w="1134"/>
+            <w:tcW w:type="dxa" w:w="1191"/>
           </w:tcPr>
           <w:p>
             <w:pPr>

</xml_diff>